<commit_message>
Remove the report conclusion section
</commit_message>
<xml_diff>
--- a/cm3321-expert-system-224096B/DentalExplain Report.docx
+++ b/cm3321-expert-system-224096B/DentalExplain Report.docx
@@ -414,7 +414,7 @@
         <w:rPr>
           <w:rFonts w:cs="Times New Roman"/>
         </w:rPr>
-        <w:t>9 Conclusion</w:t>
+        <w:t>References</w:t>
       </w:r>
       <w:r>
         <w:rPr>
@@ -435,7 +435,7 @@
         <w:rPr>
           <w:rFonts w:cs="Times New Roman"/>
         </w:rPr>
-        <w:t>References</w:t>
+        <w:t>Appendix A User Manual</w:t>
       </w:r>
       <w:r>
         <w:rPr>
@@ -456,14 +456,14 @@
         <w:rPr>
           <w:rFonts w:cs="Times New Roman"/>
         </w:rPr>
-        <w:t>Appendix A User Manual</w:t>
+        <w:t>Appendix B Human Expert Questionnaire</w:t>
       </w:r>
       <w:r>
         <w:rPr>
           <w:rFonts w:cs="Times New Roman"/>
         </w:rPr>
         <w:tab/>
-        <w:t>22</w:t>
+        <w:t>23</w:t>
       </w:r>
     </w:p>
     <w:p>
@@ -477,35 +477,14 @@
         <w:rPr>
           <w:rFonts w:cs="Times New Roman"/>
         </w:rPr>
-        <w:t>Appendix B Human Expert Questionnaire</w:t>
+        <w:t>Appendix C Knowledge Catalogue</w:t>
       </w:r>
       <w:r>
         <w:rPr>
           <w:rFonts w:cs="Times New Roman"/>
         </w:rPr>
         <w:tab/>
-        <w:t>24</w:t>
-      </w:r>
-    </w:p>
-    <w:p>
-      <w:pPr>
-        <w:tabs>
-          <w:tab w:val="right" w:leader="dot" w:pos="9360"/>
-        </w:tabs>
-        <w:spacing w:after="155"/>
-      </w:pPr>
-      <w:r>
-        <w:rPr>
-          <w:rFonts w:cs="Times New Roman"/>
-        </w:rPr>
-        <w:t>Appendix C Knowledge Catalogue</w:t>
-      </w:r>
-      <w:r>
-        <w:rPr>
-          <w:rFonts w:cs="Times New Roman"/>
-        </w:rPr>
-        <w:tab/>
-        <w:t>26</w:t>
+        <w:t>25</w:t>
       </w:r>
     </w:p>
     <w:p>
@@ -4924,44 +4903,6 @@
           <w:rFonts w:cs="Times New Roman"/>
         </w:rPr>
         <w:t>The submission assembly verifies source inclusion, report files, six root installation scripts, runtime-free application files, executable permissions and SHA-256 checksums. Launch checks use extracted folders containing spaces. Recorded software results do not establish diagnostic accuracy in real patients; clinical knowledge and expectations remain pending review.</w:t>
-      </w:r>
-    </w:p>
-    <w:p>
-      <w:pPr>
-        <w:pStyle w:val="Heading1"/>
-        <w:keepNext/>
-        <w:pageBreakBefore/>
-        <w:spacing w:after="140"/>
-      </w:pPr>
-      <w:r>
-        <w:lastRenderedPageBreak/>
-        <w:t>9 Conclusion</w:t>
-      </w:r>
-    </w:p>
-    <w:p>
-      <w:pPr>
-        <w:spacing w:line="360" w:lineRule="auto"/>
-        <w:jc w:val="both"/>
-        <w:ind w:firstLine="720"/>
-      </w:pPr>
-      <w:r>
-        <w:rPr>
-          <w:rFonts w:cs="Times New Roman"/>
-        </w:rPr>
-        <w:t>DentalExplain implements a runnable native expert system combining Java Swing with embedded SWI-Prolog through JPL. Its 27-question adaptive consultation collects controlled evidence in two steps, while 25 production rules and 30 authored domain facts support five candidate conditions through forward chaining.</w:t>
-      </w:r>
-    </w:p>
-    <w:p>
-      <w:pPr>
-        <w:spacing w:line="360" w:lineRule="auto"/>
-        <w:jc w:val="both"/>
-        <w:ind w:firstLine="720"/>
-      </w:pPr>
-      <w:r>
-        <w:rPr>
-          <w:rFonts w:cs="Times New Roman"/>
-        </w:rPr>
-        <w:t>The implementation preserves uncertainty, supports coexisting candidates and returns defined responses for incomplete, conflicting and unsupported inputs. The submission provides source, runtime-free application files, six installation scripts and a launch-only user manual. Automated verification passes across the three target platforms, with manual macOS inspection. The human expert is identified and the conducted questionnaire is supplied in Appendix B; clinical review remains pending.</w:t>
       </w:r>
     </w:p>
     <w:p>

</xml_diff>

<commit_message>
Remove desktop verification subsection from report
</commit_message>
<xml_diff>
--- a/cm3321-expert-system-224096B/DentalExplain Report.docx
+++ b/cm3321-expert-system-224096B/DentalExplain Report.docx
@@ -4867,42 +4867,6 @@
         </w:rPr>
         <w:lastRenderedPageBreak/>
         <w:t>Caries and gingivitis meet the 10-15 target in these fixtures. TC04-TC09 and TC13-TC14 exceed 15 because all five conditions and separate findings are retained. TC15-TC20 are validation/reset edge cases, not completed diagnostic walkthroughs. The separate acceptance-test document records every count.</w:t>
-      </w:r>
-    </w:p>
-    <w:p>
-      <w:pPr>
-        <w:pStyle w:val="Heading2"/>
-        <w:keepNext/>
-        <w:spacing w:before="220" w:after="140"/>
-      </w:pPr>
-      <w:r>
-        <w:t>8.3 Desktop and submission verification</w:t>
-      </w:r>
-    </w:p>
-    <w:p>
-      <w:pPr>
-        <w:spacing w:line="360" w:lineRule="auto"/>
-        <w:jc w:val="both"/>
-        <w:ind w:firstLine="720"/>
-      </w:pPr>
-      <w:r>
-        <w:rPr>
-          <w:rFonts w:cs="Times New Roman"/>
-        </w:rPr>
-        <w:t>Manual desktop verification on macOS includes consultation navigation, result display, knowledge viewing and New consultation. Windows and Linux desktop behavior was checked automatically on hosted runners; a separate manual Windows/Linux consultation is not claimed. Screenshots in this report were captured from the current installed macOS application using synthetic selections. Native window capture excludes the mouse pointer and computer-use cursor overlays.</w:t>
-      </w:r>
-    </w:p>
-    <w:p>
-      <w:pPr>
-        <w:spacing w:line="360" w:lineRule="auto"/>
-        <w:jc w:val="both"/>
-        <w:ind w:firstLine="720"/>
-      </w:pPr>
-      <w:r>
-        <w:rPr>
-          <w:rFonts w:cs="Times New Roman"/>
-        </w:rPr>
-        <w:t>The submission assembly verifies source inclusion, report files, six root installation scripts, runtime-free application files, executable permissions and SHA-256 checksums. Launch checks use extracted folders containing spaces. Recorded software results do not establish diagnostic accuracy in real patients; clinical knowledge and expectations remain pending review.</w:t>
       </w:r>
     </w:p>
     <w:p>

</xml_diff>

<commit_message>
Fit two application screenshots on each report page
</commit_message>
<xml_diff>
--- a/cm3321-expert-system-224096B/DentalExplain Report.docx
+++ b/cm3321-expert-system-224096B/DentalExplain Report.docx
@@ -400,7 +400,7 @@
           <w:rFonts w:cs="Times New Roman"/>
         </w:rPr>
         <w:tab/>
-        <w:t>18</w:t>
+        <w:t>15</w:t>
       </w:r>
     </w:p>
     <w:p>
@@ -421,7 +421,7 @@
           <w:rFonts w:cs="Times New Roman"/>
         </w:rPr>
         <w:tab/>
-        <w:t>20</w:t>
+        <w:t>17</w:t>
       </w:r>
     </w:p>
     <w:p>
@@ -442,7 +442,7 @@
           <w:rFonts w:cs="Times New Roman"/>
         </w:rPr>
         <w:tab/>
-        <w:t>21</w:t>
+        <w:t>18</w:t>
       </w:r>
     </w:p>
     <w:p>
@@ -463,7 +463,7 @@
           <w:rFonts w:cs="Times New Roman"/>
         </w:rPr>
         <w:tab/>
-        <w:t>23</w:t>
+        <w:t>20</w:t>
       </w:r>
     </w:p>
     <w:p>
@@ -484,7 +484,7 @@
           <w:rFonts w:cs="Times New Roman"/>
         </w:rPr>
         <w:tab/>
-        <w:t>25</w:t>
+        <w:t>22</w:t>
       </w:r>
     </w:p>
     <w:p>
@@ -2716,6 +2716,7 @@
         <w:pStyle w:val="Heading2"/>
         <w:keepNext/>
         <w:spacing w:before="220" w:after="140"/>
+        <w:pageBreakBefore/>
       </w:pPr>
       <w:r>
         <w:t>7.4 Welcome and consultation setup</w:t>
@@ -2724,7 +2725,7 @@
     <w:p>
       <w:pPr>
         <w:keepNext/>
-        <w:spacing w:before="120" w:after="80"/>
+        <w:spacing w:before="40" w:after="40"/>
         <w:jc w:val="center"/>
       </w:pPr>
       <w:r>
@@ -2733,7 +2734,7 @@
         </w:rPr>
         <w:drawing>
           <wp:inline distT="0" distB="0" distL="0" distR="0" wp14:anchorId="750ACAA1" wp14:editId="3A0C7428">
-            <wp:extent cx="5943600" cy="4276725"/>
+            <wp:extent cx="4937760" cy="3552972"/>
             <wp:effectExtent l="0" t="0" r="0" b="0"/>
             <wp:docPr id="2113029409" name="Figure 2 Current welcome screen" descr="Figure 2 Current welcome screen" title="Figure 2 Current welcome screen"/>
             <wp:cNvGraphicFramePr>
@@ -2758,7 +2759,7 @@
                   <pic:spPr bwMode="auto">
                     <a:xfrm>
                       <a:off x="0" y="0"/>
-                      <a:ext cx="5943600" cy="4276725"/>
+                      <a:ext cx="4937760" cy="3552972"/>
                     </a:xfrm>
                     <a:prstGeom prst="rect">
                       <a:avLst/>
@@ -2787,18 +2788,19 @@
         <w:spacing w:line="360" w:lineRule="auto"/>
         <w:jc w:val="both"/>
         <w:ind w:firstLine="720"/>
-      </w:pPr>
-      <w:r>
-        <w:rPr>
-          <w:rFonts w:cs="Times New Roman"/>
-        </w:rPr>
-        <w:t>The welcome screen offers Start consultation and View knowledge base, identifies the supported conditions and describes the consultation flow.</w:t>
-      </w:r>
-    </w:p>
-    <w:p>
-      <w:pPr>
-        <w:keepNext/>
-        <w:spacing w:before="120" w:after="80"/>
+        <w:keepNext/>
+      </w:pPr>
+      <w:r>
+        <w:rPr>
+          <w:rFonts w:cs="Times New Roman"/>
+        </w:rPr>
+        <w:t>Start a consultation or open the read-only knowledge base from the welcome screen.</w:t>
+      </w:r>
+    </w:p>
+    <w:p>
+      <w:pPr>
+        <w:keepNext/>
+        <w:spacing w:before="40" w:after="40"/>
         <w:jc w:val="center"/>
       </w:pPr>
       <w:r>
@@ -2808,7 +2810,7 @@
         <w:lastRenderedPageBreak/>
         <w:drawing>
           <wp:inline distT="0" distB="0" distL="0" distR="0" wp14:anchorId="0AD0EB24" wp14:editId="0BD977EF">
-            <wp:extent cx="5943600" cy="4276725"/>
+            <wp:extent cx="4937760" cy="3552972"/>
             <wp:effectExtent l="0" t="0" r="0" b="0"/>
             <wp:docPr id="821070850" name="Figure 3 Current setup with predefined age and affected-tooth selections" descr="Figure 3 Current setup with predefined age and affected-tooth selections" title="Figure 3 Current setup with predefined age and affected-tooth selections"/>
             <wp:cNvGraphicFramePr>
@@ -2833,7 +2835,7 @@
                   <pic:spPr bwMode="auto">
                     <a:xfrm>
                       <a:off x="0" y="0"/>
-                      <a:ext cx="5943600" cy="4276725"/>
+                      <a:ext cx="4937760" cy="3552972"/>
                     </a:xfrm>
                     <a:prstGeom prst="rect">
                       <a:avLst/>
@@ -2854,7 +2856,7 @@
         <w:jc w:val="center"/>
       </w:pPr>
       <w:r>
-        <w:t>Figure 3 Current setup with predefined age and affected-tooth selections</w:t>
+        <w:t>Figure 3 Age group and affected tooth setup</w:t>
       </w:r>
     </w:p>
     <w:p>
@@ -2867,7 +2869,7 @@
         <w:rPr>
           <w:rFonts w:cs="Times New Roman"/>
         </w:rPr>
-        <w:t>Setup uses two non-editable dropdowns. Age group does not automatically determine tooth type or diagnosis. The form retains its white background, internal padding and consistent Latin Modern Sans typography.</w:t>
+        <w:t>Select an age group and affected tooth type using predefined dropdowns. Age alone does not determine diagnosis.</w:t>
       </w:r>
     </w:p>
     <w:p>
@@ -2875,6 +2877,7 @@
         <w:pStyle w:val="Heading2"/>
         <w:keepNext/>
         <w:spacing w:before="220" w:after="140"/>
+        <w:pageBreakBefore/>
       </w:pPr>
       <w:r>
         <w:lastRenderedPageBreak/>
@@ -2884,7 +2887,7 @@
     <w:p>
       <w:pPr>
         <w:keepNext/>
-        <w:spacing w:before="120" w:after="80"/>
+        <w:spacing w:before="40" w:after="40"/>
         <w:jc w:val="center"/>
       </w:pPr>
       <w:r>
@@ -2893,7 +2896,7 @@
         </w:rPr>
         <w:drawing>
           <wp:inline distT="0" distB="0" distL="0" distR="0" wp14:anchorId="30DAB39D" wp14:editId="512952D2">
-            <wp:extent cx="5943600" cy="4276725"/>
+            <wp:extent cx="4937760" cy="3552972"/>
             <wp:effectExtent l="0" t="0" r="0" b="0"/>
             <wp:docPr id="1808183501" name="Figure 4 Pain selection reveals question-specific symptom follow-ups" descr="Figure 4 Pain selection reveals question-specific symptom follow-ups" title="Figure 4 Pain selection reveals question-specific symptom follow-ups"/>
             <wp:cNvGraphicFramePr>
@@ -2918,7 +2921,7 @@
                   <pic:spPr bwMode="auto">
                     <a:xfrm>
                       <a:off x="0" y="0"/>
-                      <a:ext cx="5943600" cy="4276725"/>
+                      <a:ext cx="4937760" cy="3552972"/>
                     </a:xfrm>
                     <a:prstGeom prst="rect">
                       <a:avLst/>
@@ -2939,7 +2942,7 @@
         <w:jc w:val="center"/>
       </w:pPr>
       <w:r>
-        <w:t>Figure 4 Pain selection reveals question-specific symptom follow-ups</w:t>
+        <w:t>Figure 4 Reported symptoms and conditional follow-ups</w:t>
       </w:r>
     </w:p>
     <w:p>
@@ -2947,18 +2950,19 @@
         <w:spacing w:line="360" w:lineRule="auto"/>
         <w:jc w:val="both"/>
         <w:ind w:firstLine="720"/>
-      </w:pPr>
-      <w:r>
-        <w:rPr>
-          <w:rFonts w:cs="Times New Roman"/>
-        </w:rPr>
-        <w:t>Step 1 separates reported symptoms from examination findings. Reporting tooth pain reveals trigger, persistence, spontaneous and sleep-interruption questions. Checkbox special answers remain mutually exclusive with findings.</w:t>
-      </w:r>
-    </w:p>
-    <w:p>
-      <w:pPr>
-        <w:keepNext/>
-        <w:spacing w:before="120" w:after="80"/>
+        <w:keepNext/>
+      </w:pPr>
+      <w:r>
+        <w:rPr>
+          <w:rFonts w:cs="Times New Roman"/>
+        </w:rPr>
+        <w:t>Tooth pain reveals trigger, persistence, spontaneous-pain and sleep-interruption questions. Checkbox uncertainty options are mutually exclusive with findings.</w:t>
+      </w:r>
+    </w:p>
+    <w:p>
+      <w:pPr>
+        <w:keepNext/>
+        <w:spacing w:before="40" w:after="40"/>
         <w:jc w:val="center"/>
       </w:pPr>
       <w:r>
@@ -2968,7 +2972,7 @@
         <w:lastRenderedPageBreak/>
         <w:drawing>
           <wp:inline distT="0" distB="0" distL="0" distR="0" wp14:anchorId="395B1263" wp14:editId="75DD4078">
-            <wp:extent cx="5943600" cy="4276725"/>
+            <wp:extent cx="4937760" cy="3552972"/>
             <wp:effectExtent l="0" t="0" r="0" b="0"/>
             <wp:docPr id="1898996294" name="Figure 5 Dentist-supplied findings in the second questionnaire step" descr="Figure 5 Dentist-supplied findings in the second questionnaire step" title="Figure 5 Dentist-supplied findings in the second questionnaire step"/>
             <wp:cNvGraphicFramePr>
@@ -2993,7 +2997,7 @@
                   <pic:spPr bwMode="auto">
                     <a:xfrm>
                       <a:off x="0" y="0"/>
-                      <a:ext cx="5943600" cy="4276725"/>
+                      <a:ext cx="4937760" cy="3552972"/>
                     </a:xfrm>
                     <a:prstGeom prst="rect">
                       <a:avLst/>
@@ -3014,7 +3018,7 @@
         <w:jc w:val="center"/>
       </w:pPr>
       <w:r>
-        <w:t>Figure 5 Dentist-supplied findings in the second questionnaire step</w:t>
+        <w:t>Figure 5 Relevant dentist-supplied findings</w:t>
       </w:r>
     </w:p>
     <w:p>
@@ -3027,7 +3031,7 @@
         <w:rPr>
           <w:rFonts w:cs="Times New Roman"/>
         </w:rPr>
-        <w:t>Step 2 presents applicable caries, pulp/apical and periodontal findings. Long forms scroll, while Back and Assess actions remain available outside the scroll area. Uncertainty keeps potentially relevant follow-ups available.</w:t>
+        <w:t>Enter applicable caries, pulp/apical and periodontal findings. Unknown answers retain relevant follow-ups; Back and Assess remain available.</w:t>
       </w:r>
     </w:p>
     <w:p>
@@ -3035,6 +3039,7 @@
         <w:pStyle w:val="Heading2"/>
         <w:keepNext/>
         <w:spacing w:before="220" w:after="140"/>
+        <w:pageBreakBefore/>
       </w:pPr>
       <w:r>
         <w:lastRenderedPageBreak/>
@@ -3044,7 +3049,7 @@
     <w:p>
       <w:pPr>
         <w:keepNext/>
-        <w:spacing w:before="120" w:after="80"/>
+        <w:spacing w:before="40" w:after="40"/>
         <w:jc w:val="center"/>
       </w:pPr>
       <w:r>
@@ -3053,7 +3058,7 @@
         </w:rPr>
         <w:drawing>
           <wp:inline distT="0" distB="0" distL="0" distR="0" wp14:anchorId="43FF39FF" wp14:editId="3160D5F6">
-            <wp:extent cx="5943600" cy="4276725"/>
+            <wp:extent cx="4937760" cy="3552972"/>
             <wp:effectExtent l="0" t="0" r="0" b="0"/>
             <wp:docPr id="1679502985" name="Figure 6 Coexisting supported candidates from a synthetic consultation" descr="Figure 6 Coexisting supported candidates from a synthetic consultation" title="Figure 6 Coexisting supported candidates from a synthetic consultation"/>
             <wp:cNvGraphicFramePr>
@@ -3078,7 +3083,7 @@
                   <pic:spPr bwMode="auto">
                     <a:xfrm>
                       <a:off x="0" y="0"/>
-                      <a:ext cx="5943600" cy="4276725"/>
+                      <a:ext cx="4937760" cy="3552972"/>
                     </a:xfrm>
                     <a:prstGeom prst="rect">
                       <a:avLst/>
@@ -3099,7 +3104,7 @@
         <w:jc w:val="center"/>
       </w:pPr>
       <w:r>
-        <w:t>Figure 6 Coexisting supported candidates from a synthetic consultation</w:t>
+        <w:t>Figure 6 Coexisting supported candidates</w:t>
       </w:r>
     </w:p>
     <w:p>
@@ -3107,18 +3112,19 @@
         <w:spacing w:line="360" w:lineRule="auto"/>
         <w:jc w:val="both"/>
         <w:ind w:firstLine="720"/>
-      </w:pPr>
-      <w:r>
-        <w:rPr>
-          <w:rFonts w:cs="Times New Roman"/>
-        </w:rPr>
-        <w:t>Results display supported candidates and any additional requested findings. New consultation is the only result action. The screenshot shows coexisting caries and reversible-pulpitis candidates from the illustrated synthetic pain consultation.</w:t>
-      </w:r>
-    </w:p>
-    <w:p>
-      <w:pPr>
-        <w:keepNext/>
-        <w:spacing w:before="120" w:after="80"/>
+        <w:keepNext/>
+      </w:pPr>
+      <w:r>
+        <w:rPr>
+          <w:rFonts w:cs="Times New Roman"/>
+        </w:rPr>
+        <w:t>Results can include coexisting candidates, as shown for caries and reversible pulpitis. New consultation clears all answers.</w:t>
+      </w:r>
+    </w:p>
+    <w:p>
+      <w:pPr>
+        <w:keepNext/>
+        <w:spacing w:before="40" w:after="40"/>
         <w:jc w:val="center"/>
       </w:pPr>
       <w:r>
@@ -3128,7 +3134,7 @@
         <w:lastRenderedPageBreak/>
         <w:drawing>
           <wp:inline distT="0" distB="0" distL="0" distR="0" wp14:anchorId="6AFD0E8A" wp14:editId="0923AB9D">
-            <wp:extent cx="5943600" cy="4276725"/>
+            <wp:extent cx="4937760" cy="3552972"/>
             <wp:effectExtent l="0" t="0" r="0" b="0"/>
             <wp:docPr id="1711110870" name="Figure 7 Read-only knowledge workspace with separate catalogue tabs" descr="Figure 7 Read-only knowledge workspace with separate catalogue tabs" title="Figure 7 Read-only knowledge workspace with separate catalogue tabs"/>
             <wp:cNvGraphicFramePr>
@@ -3153,7 +3159,7 @@
                   <pic:spPr bwMode="auto">
                     <a:xfrm>
                       <a:off x="0" y="0"/>
-                      <a:ext cx="5943600" cy="4276725"/>
+                      <a:ext cx="4937760" cy="3552972"/>
                     </a:xfrm>
                     <a:prstGeom prst="rect">
                       <a:avLst/>
@@ -3174,7 +3180,7 @@
         <w:jc w:val="center"/>
       </w:pPr>
       <w:r>
-        <w:t>Figure 7 Read-only knowledge workspace with separate catalogue tabs</w:t>
+        <w:t>Figure 7 Read-only knowledge workspace</w:t>
       </w:r>
     </w:p>
     <w:p>
@@ -3187,7 +3193,7 @@
         <w:rPr>
           <w:rFonts w:cs="Times New Roman"/>
         </w:rPr>
-        <w:t>Questions, Facts and Rules have separate counts. Search filters the active table, and selecting a row displays its full content and source. The workspace provides inspection rather than knowledge editing.</w:t>
+        <w:t>Search the read-only Questions, Facts and Rules tabs. Selecting a row shows its content and source.</w:t>
       </w:r>
     </w:p>
     <w:p>

</xml_diff>

<commit_message>
Remove per-rule source labels from the report
</commit_message>
<xml_diff>
--- a/cm3321-expert-system-224096B/DentalExplain Report.docx
+++ b/cm3321-expert-system-224096B/DentalExplain Report.docx
@@ -8473,10 +8473,10 @@
     </w:p>
     <w:p>
       <w:pPr>
-        <w:keepNext/>
         <w:spacing w:after="35" w:line="360" w:lineRule="auto"/>
         <w:jc w:val="both"/>
         <w:ind w:firstLine="720"/>
+        <w:keepLines/>
       </w:pPr>
       <w:r>
         <w:rPr>
@@ -8485,15 +8485,6 @@
           <w:szCs w:val="20"/>
         </w:rPr>
         <w:t>IF eq(cavity,yes) AND eq(soft_tissue,yes) THEN carious_lesion.</w:t>
-      </w:r>
-    </w:p>
-    <w:p>
-      <w:pPr>
-        <w:pStyle w:val="Caption"/>
-        <w:spacing w:after="65" w:line="200" w:lineRule="auto"/>
-      </w:pPr>
-      <w:r>
-        <w:t>Source: nidcr; review: pending.</w:t>
       </w:r>
     </w:p>
     <w:p>
@@ -8514,10 +8505,10 @@
     </w:p>
     <w:p>
       <w:pPr>
-        <w:keepNext/>
         <w:spacing w:after="35" w:line="360" w:lineRule="auto"/>
         <w:jc w:val="both"/>
         <w:ind w:firstLine="720"/>
+        <w:keepLines/>
       </w:pPr>
       <w:r>
         <w:rPr>
@@ -8526,15 +8517,6 @@
           <w:szCs w:val="20"/>
         </w:rPr>
         <w:t>IF eq(radiographic_caries,yes) THEN carious_lesion.</w:t>
-      </w:r>
-    </w:p>
-    <w:p>
-      <w:pPr>
-        <w:pStyle w:val="Caption"/>
-        <w:spacing w:after="65" w:line="200" w:lineRule="auto"/>
-      </w:pPr>
-      <w:r>
-        <w:t>Source: nidcr; review: pending.</w:t>
       </w:r>
     </w:p>
     <w:p>
@@ -8555,10 +8537,10 @@
     </w:p>
     <w:p>
       <w:pPr>
-        <w:keepNext/>
         <w:spacing w:after="35" w:line="360" w:lineRule="auto"/>
         <w:jc w:val="both"/>
         <w:ind w:firstLine="720"/>
+        <w:keepLines/>
       </w:pPr>
       <w:r>
         <w:rPr>
@@ -8567,15 +8549,6 @@
           <w:szCs w:val="20"/>
         </w:rPr>
         <w:t>IF eq(discoloration,yes) AND eq(soft_tissue,yes) THEN carious_lesion.</w:t>
-      </w:r>
-    </w:p>
-    <w:p>
-      <w:pPr>
-        <w:pStyle w:val="Caption"/>
-        <w:spacing w:after="65" w:line="200" w:lineRule="auto"/>
-      </w:pPr>
-      <w:r>
-        <w:t>Source: nidcr; review: pending.</w:t>
       </w:r>
     </w:p>
     <w:p>
@@ -8596,10 +8569,10 @@
     </w:p>
     <w:p>
       <w:pPr>
-        <w:keepNext/>
         <w:spacing w:after="35" w:line="360" w:lineRule="auto"/>
         <w:jc w:val="both"/>
         <w:ind w:firstLine="720"/>
+        <w:keepLines/>
       </w:pPr>
       <w:r>
         <w:rPr>
@@ -8608,15 +8581,6 @@
           <w:szCs w:val="20"/>
         </w:rPr>
         <w:t>IF derived(carious_lesion) AND kb(applicable_dentition(caries,both)) THEN candidate(caries).</w:t>
-      </w:r>
-    </w:p>
-    <w:p>
-      <w:pPr>
-        <w:pStyle w:val="Caption"/>
-        <w:spacing w:after="65" w:line="200" w:lineRule="auto"/>
-      </w:pPr>
-      <w:r>
-        <w:t>Source: nidcr; review: pending.</w:t>
       </w:r>
     </w:p>
     <w:p>
@@ -8637,10 +8601,10 @@
     </w:p>
     <w:p>
       <w:pPr>
-        <w:keepNext/>
         <w:spacing w:after="35" w:line="360" w:lineRule="auto"/>
         <w:jc w:val="both"/>
         <w:ind w:firstLine="720"/>
+        <w:keepLines/>
       </w:pPr>
       <w:r>
         <w:rPr>
@@ -8649,15 +8613,6 @@
           <w:szCs w:val="20"/>
         </w:rPr>
         <w:t>IF eq(tooth_pain,yes) AND eq(trigger_cold,yes) AND kb(pulpal_trigger(cold)) THEN provoked_pain.</w:t>
-      </w:r>
-    </w:p>
-    <w:p>
-      <w:pPr>
-        <w:pStyle w:val="Caption"/>
-        <w:spacing w:after="65" w:line="200" w:lineRule="auto"/>
-      </w:pPr>
-      <w:r>
-        <w:t>Source: aae; review: pending.</w:t>
       </w:r>
     </w:p>
     <w:p>
@@ -8678,10 +8633,10 @@
     </w:p>
     <w:p>
       <w:pPr>
-        <w:keepNext/>
         <w:spacing w:after="35" w:line="360" w:lineRule="auto"/>
         <w:jc w:val="both"/>
         <w:ind w:firstLine="720"/>
+        <w:keepLines/>
       </w:pPr>
       <w:r>
         <w:rPr>
@@ -8690,15 +8645,6 @@
           <w:szCs w:val="20"/>
         </w:rPr>
         <w:t>IF eq(tooth_pain,yes) AND eq(trigger_sweet,yes) AND kb(pulpal_trigger(sweet)) THEN provoked_pain.</w:t>
-      </w:r>
-    </w:p>
-    <w:p>
-      <w:pPr>
-        <w:pStyle w:val="Caption"/>
-        <w:spacing w:after="65" w:line="200" w:lineRule="auto"/>
-      </w:pPr>
-      <w:r>
-        <w:t>Source: nidcr; review: pending.</w:t>
       </w:r>
     </w:p>
     <w:p>
@@ -8719,10 +8665,10 @@
     </w:p>
     <w:p>
       <w:pPr>
-        <w:keepNext/>
         <w:spacing w:after="35" w:line="360" w:lineRule="auto"/>
         <w:jc w:val="both"/>
         <w:ind w:firstLine="720"/>
+        <w:keepLines/>
       </w:pPr>
       <w:r>
         <w:rPr>
@@ -8731,15 +8677,6 @@
           <w:szCs w:val="20"/>
         </w:rPr>
         <w:t>IF eq(tooth_pain,yes) AND eq(trigger_hot,yes) AND kb(pulpal_trigger(hot)) THEN provoked_pain.</w:t>
-      </w:r>
-    </w:p>
-    <w:p>
-      <w:pPr>
-        <w:pStyle w:val="Caption"/>
-        <w:spacing w:after="65" w:line="200" w:lineRule="auto"/>
-      </w:pPr>
-      <w:r>
-        <w:t>Source: aae; review: pending.</w:t>
       </w:r>
     </w:p>
     <w:p>
@@ -8760,10 +8697,10 @@
     </w:p>
     <w:p>
       <w:pPr>
-        <w:keepNext/>
         <w:spacing w:after="35" w:line="360" w:lineRule="auto"/>
         <w:jc w:val="both"/>
         <w:ind w:firstLine="720"/>
+        <w:keepLines/>
       </w:pPr>
       <w:r>
         <w:rPr>
@@ -8772,15 +8709,6 @@
           <w:szCs w:val="20"/>
         </w:rPr>
         <w:t>IF derived(provoked_pain) AND eq(persistence,brief) THEN brief_provoked_pain.</w:t>
-      </w:r>
-    </w:p>
-    <w:p>
-      <w:pPr>
-        <w:pStyle w:val="Caption"/>
-        <w:spacing w:after="65" w:line="200" w:lineRule="auto"/>
-      </w:pPr>
-      <w:r>
-        <w:t>Source: aapd; review: pending.</w:t>
       </w:r>
     </w:p>
     <w:p>
@@ -8801,10 +8729,10 @@
     </w:p>
     <w:p>
       <w:pPr>
-        <w:keepNext/>
         <w:spacing w:after="35" w:line="360" w:lineRule="auto"/>
         <w:jc w:val="both"/>
         <w:ind w:firstLine="720"/>
+        <w:keepLines/>
       </w:pPr>
       <w:r>
         <w:rPr>
@@ -8813,15 +8741,6 @@
           <w:szCs w:val="20"/>
         </w:rPr>
         <w:t>IF derived(brief_provoked_pain) AND derived(carious_lesion) AND eq(spontaneous,no) AND eq(sleep_pain,no) AND eq(percussion,no) AND eq(apical_pathology,no) AND eq(facial_swelling,no) AND eq(drainage,no) AND eq(fever,no) THEN reversible_pattern.</w:t>
-      </w:r>
-    </w:p>
-    <w:p>
-      <w:pPr>
-        <w:pStyle w:val="Caption"/>
-        <w:spacing w:after="65" w:line="200" w:lineRule="auto"/>
-      </w:pPr>
-      <w:r>
-        <w:t>Source: aapd; review: pending.</w:t>
       </w:r>
     </w:p>
     <w:p>
@@ -8842,10 +8761,10 @@
     </w:p>
     <w:p>
       <w:pPr>
-        <w:keepNext/>
         <w:spacing w:after="35" w:line="360" w:lineRule="auto"/>
         <w:jc w:val="both"/>
         <w:ind w:firstLine="720"/>
+        <w:keepLines/>
       </w:pPr>
       <w:r>
         <w:rPr>
@@ -8854,15 +8773,6 @@
           <w:szCs w:val="20"/>
         </w:rPr>
         <w:t>IF derived(reversible_pattern) AND eq(tooth_type,primary) AND kb(unreliable_pulp_test(primary)) THEN candidate(reversible_pulpitis).</w:t>
-      </w:r>
-    </w:p>
-    <w:p>
-      <w:pPr>
-        <w:pStyle w:val="Caption"/>
-        <w:spacing w:after="65" w:line="200" w:lineRule="auto"/>
-      </w:pPr>
-      <w:r>
-        <w:t>Source: aapd; review: pending.</w:t>
       </w:r>
     </w:p>
     <w:p>
@@ -8883,10 +8793,10 @@
     </w:p>
     <w:p>
       <w:pPr>
-        <w:keepNext/>
         <w:spacing w:after="35" w:line="360" w:lineRule="auto"/>
         <w:jc w:val="both"/>
         <w:ind w:firstLine="720"/>
+        <w:keepLines/>
       </w:pPr>
       <w:r>
         <w:rPr>
@@ -8895,15 +8805,6 @@
           <w:szCs w:val="20"/>
         </w:rPr>
         <w:t>IF derived(reversible_pattern) AND eq(tooth_type,permanent) AND eq(root_maturity,immature) AND kb(unreliable_pulp_test(immature)) THEN candidate(reversible_pulpitis).</w:t>
-      </w:r>
-    </w:p>
-    <w:p>
-      <w:pPr>
-        <w:pStyle w:val="Caption"/>
-        <w:spacing w:after="65" w:line="200" w:lineRule="auto"/>
-      </w:pPr>
-      <w:r>
-        <w:t>Source: aapd; review: pending.</w:t>
       </w:r>
     </w:p>
     <w:p>
@@ -8924,10 +8825,10 @@
     </w:p>
     <w:p>
       <w:pPr>
-        <w:keepNext/>
         <w:spacing w:after="35" w:line="360" w:lineRule="auto"/>
         <w:jc w:val="both"/>
         <w:ind w:firstLine="720"/>
+        <w:keepLines/>
       </w:pPr>
       <w:r>
         <w:rPr>
@@ -8936,15 +8837,6 @@
           <w:szCs w:val="20"/>
         </w:rPr>
         <w:t>IF derived(reversible_pattern) AND eq(tooth_type,permanent) AND eq(root_maturity,mature) AND eq(thermal_response,brief) THEN candidate(reversible_pulpitis).</w:t>
-      </w:r>
-    </w:p>
-    <w:p>
-      <w:pPr>
-        <w:pStyle w:val="Caption"/>
-        <w:spacing w:after="65" w:line="200" w:lineRule="auto"/>
-      </w:pPr>
-      <w:r>
-        <w:t>Source: aae; review: pending.</w:t>
       </w:r>
     </w:p>
     <w:p>
@@ -8965,10 +8857,10 @@
     </w:p>
     <w:p>
       <w:pPr>
-        <w:keepNext/>
         <w:spacing w:after="35" w:line="360" w:lineRule="auto"/>
         <w:jc w:val="both"/>
         <w:ind w:firstLine="720"/>
+        <w:keepLines/>
       </w:pPr>
       <w:r>
         <w:rPr>
@@ -8977,15 +8869,6 @@
           <w:szCs w:val="20"/>
         </w:rPr>
         <w:t>IF eq(tooth_pain,yes) AND eq(spontaneous,yes) AND kb(supports(spontaneous_pain,irreversible_pulpitis)) THEN irreversible_pattern.</w:t>
-      </w:r>
-    </w:p>
-    <w:p>
-      <w:pPr>
-        <w:pStyle w:val="Caption"/>
-        <w:spacing w:after="65" w:line="200" w:lineRule="auto"/>
-      </w:pPr>
-      <w:r>
-        <w:t>Source: aae; review: pending.</w:t>
       </w:r>
     </w:p>
     <w:p>
@@ -9006,10 +8889,10 @@
     </w:p>
     <w:p>
       <w:pPr>
-        <w:keepNext/>
         <w:spacing w:after="35" w:line="360" w:lineRule="auto"/>
         <w:jc w:val="both"/>
         <w:ind w:firstLine="720"/>
+        <w:keepLines/>
       </w:pPr>
       <w:r>
         <w:rPr>
@@ -9018,15 +8901,6 @@
           <w:szCs w:val="20"/>
         </w:rPr>
         <w:t>IF derived(provoked_pain) AND eq(persistence,lingering) AND kb(supports(lingering_pain,irreversible_pulpitis)) THEN irreversible_pattern.</w:t>
-      </w:r>
-    </w:p>
-    <w:p>
-      <w:pPr>
-        <w:pStyle w:val="Caption"/>
-        <w:spacing w:after="65" w:line="200" w:lineRule="auto"/>
-      </w:pPr>
-      <w:r>
-        <w:t>Source: aae; review: pending.</w:t>
       </w:r>
     </w:p>
     <w:p>
@@ -9048,10 +8922,10 @@
     </w:p>
     <w:p>
       <w:pPr>
-        <w:keepNext/>
         <w:spacing w:after="35" w:line="360" w:lineRule="auto"/>
         <w:jc w:val="both"/>
         <w:ind w:firstLine="720"/>
+        <w:keepLines/>
       </w:pPr>
       <w:r>
         <w:rPr>
@@ -9060,15 +8934,6 @@
           <w:szCs w:val="20"/>
         </w:rPr>
         <w:t>IF derived(irreversible_pattern) AND derived(carious_lesion) AND eq(tooth_type,primary) AND eq(sleep_pain,yes) THEN candidate(irreversible_pulpitis).</w:t>
-      </w:r>
-    </w:p>
-    <w:p>
-      <w:pPr>
-        <w:pStyle w:val="Caption"/>
-        <w:spacing w:after="65" w:line="200" w:lineRule="auto"/>
-      </w:pPr>
-      <w:r>
-        <w:t>Source: aapd; review: pending.</w:t>
       </w:r>
     </w:p>
     <w:p>
@@ -9089,10 +8954,10 @@
     </w:p>
     <w:p>
       <w:pPr>
-        <w:keepNext/>
         <w:spacing w:after="35" w:line="360" w:lineRule="auto"/>
         <w:jc w:val="both"/>
         <w:ind w:firstLine="720"/>
+        <w:keepLines/>
       </w:pPr>
       <w:r>
         <w:rPr>
@@ -9101,15 +8966,6 @@
           <w:szCs w:val="20"/>
         </w:rPr>
         <w:t>IF derived(irreversible_pattern) AND derived(carious_lesion) AND eq(tooth_type,permanent) AND eq(root_maturity,mature) AND eq(thermal_response,lingering) THEN candidate(irreversible_pulpitis).</w:t>
-      </w:r>
-    </w:p>
-    <w:p>
-      <w:pPr>
-        <w:pStyle w:val="Caption"/>
-        <w:spacing w:after="65" w:line="200" w:lineRule="auto"/>
-      </w:pPr>
-      <w:r>
-        <w:t>Source: aae; review: pending.</w:t>
       </w:r>
     </w:p>
     <w:p>
@@ -9130,10 +8986,10 @@
     </w:p>
     <w:p>
       <w:pPr>
-        <w:keepNext/>
         <w:spacing w:after="35" w:line="360" w:lineRule="auto"/>
         <w:jc w:val="both"/>
         <w:ind w:firstLine="720"/>
+        <w:keepLines/>
       </w:pPr>
       <w:r>
         <w:rPr>
@@ -9142,15 +8998,6 @@
           <w:szCs w:val="20"/>
         </w:rPr>
         <w:t>IF derived(irreversible_pattern) AND derived(carious_lesion) AND eq(tooth_type,permanent) AND eq(root_maturity,immature) AND eq(sleep_pain,yes) THEN candidate(irreversible_pulpitis).</w:t>
-      </w:r>
-    </w:p>
-    <w:p>
-      <w:pPr>
-        <w:pStyle w:val="Caption"/>
-        <w:spacing w:after="65" w:line="200" w:lineRule="auto"/>
-      </w:pPr>
-      <w:r>
-        <w:t>Source: aapd; review: pending.</w:t>
       </w:r>
     </w:p>
     <w:p>
@@ -9171,10 +9018,10 @@
     </w:p>
     <w:p>
       <w:pPr>
-        <w:keepNext/>
         <w:spacing w:after="35" w:line="360" w:lineRule="auto"/>
         <w:jc w:val="both"/>
         <w:ind w:firstLine="720"/>
+        <w:keepLines/>
       </w:pPr>
       <w:r>
         <w:rPr>
@@ -9183,15 +9030,6 @@
           <w:szCs w:val="20"/>
         </w:rPr>
         <w:t>IF eq(gum_bleeding,yes) AND eq(plaque,yes) THEN gingival_inflammation.</w:t>
-      </w:r>
-    </w:p>
-    <w:p>
-      <w:pPr>
-        <w:pStyle w:val="Caption"/>
-        <w:spacing w:after="65" w:line="200" w:lineRule="auto"/>
-      </w:pPr>
-      <w:r>
-        <w:t>Source: aap; review: pending.</w:t>
       </w:r>
     </w:p>
     <w:p>
@@ -9212,10 +9050,10 @@
     </w:p>
     <w:p>
       <w:pPr>
-        <w:keepNext/>
         <w:spacing w:after="35" w:line="360" w:lineRule="auto"/>
         <w:jc w:val="both"/>
         <w:ind w:firstLine="720"/>
+        <w:keepLines/>
       </w:pPr>
       <w:r>
         <w:rPr>
@@ -9224,15 +9062,6 @@
           <w:szCs w:val="20"/>
         </w:rPr>
         <w:t>IF eq(red_gums,yes) AND eq(plaque,yes) THEN gingival_inflammation.</w:t>
-      </w:r>
-    </w:p>
-    <w:p>
-      <w:pPr>
-        <w:pStyle w:val="Caption"/>
-        <w:spacing w:after="65" w:line="200" w:lineRule="auto"/>
-      </w:pPr>
-      <w:r>
-        <w:t>Source: aap; review: pending.</w:t>
       </w:r>
     </w:p>
     <w:p>
@@ -9253,10 +9082,10 @@
     </w:p>
     <w:p>
       <w:pPr>
-        <w:keepNext/>
         <w:spacing w:after="35" w:line="360" w:lineRule="auto"/>
         <w:jc w:val="both"/>
         <w:ind w:firstLine="720"/>
+        <w:keepLines/>
       </w:pPr>
       <w:r>
         <w:rPr>
@@ -9265,15 +9094,6 @@
           <w:szCs w:val="20"/>
         </w:rPr>
         <w:t>IF derived(gingival_inflammation) AND eq(cal_mm,0) AND eq(prior_destruction,no) AND lte(pocket_mm,3) AND kb(intact_periodontium(gingivitis,0)) THEN candidate(gingivitis).</w:t>
-      </w:r>
-    </w:p>
-    <w:p>
-      <w:pPr>
-        <w:pStyle w:val="Caption"/>
-        <w:spacing w:after="65" w:line="200" w:lineRule="auto"/>
-      </w:pPr>
-      <w:r>
-        <w:t>Source: efp_g; review: pending.</w:t>
       </w:r>
     </w:p>
     <w:p>
@@ -9294,10 +9114,10 @@
     </w:p>
     <w:p>
       <w:pPr>
-        <w:keepNext/>
         <w:spacing w:after="35" w:line="360" w:lineRule="auto"/>
         <w:jc w:val="both"/>
         <w:ind w:firstLine="720"/>
+        <w:keepLines/>
       </w:pPr>
       <w:r>
         <w:rPr>
@@ -9306,15 +9126,6 @@
           <w:szCs w:val="20"/>
         </w:rPr>
         <w:t>IF gt(cal_mm,0) AND eq(nonadjacent_teeth,yes) AND eq(nonperiodontal_causes,no) AND kb(exclude_nonperiodontal_causes) THEN periodontal_destruction.</w:t>
-      </w:r>
-    </w:p>
-    <w:p>
-      <w:pPr>
-        <w:pStyle w:val="Caption"/>
-        <w:spacing w:after="65" w:line="200" w:lineRule="auto"/>
-      </w:pPr>
-      <w:r>
-        <w:t>Source: efp; review: pending.</w:t>
       </w:r>
     </w:p>
     <w:p>
@@ -9335,10 +9146,10 @@
     </w:p>
     <w:p>
       <w:pPr>
-        <w:keepNext/>
         <w:spacing w:after="35" w:line="360" w:lineRule="auto"/>
         <w:jc w:val="both"/>
         <w:ind w:firstLine="720"/>
+        <w:keepLines/>
       </w:pPr>
       <w:r>
         <w:rPr>
@@ -9347,15 +9158,6 @@
           <w:szCs w:val="20"/>
         </w:rPr>
         <w:t>IF gte(buccal_cal_mm,3) AND derived(deep_pocket) AND eq(two_teeth,yes) AND eq(nonperiodontal_causes,no) THEN periodontal_destruction.</w:t>
-      </w:r>
-    </w:p>
-    <w:p>
-      <w:pPr>
-        <w:pStyle w:val="Caption"/>
-        <w:spacing w:after="65" w:line="200" w:lineRule="auto"/>
-      </w:pPr>
-      <w:r>
-        <w:t>Source: efp; review: pending.</w:t>
       </w:r>
     </w:p>
     <w:p>
@@ -9376,10 +9178,10 @@
     </w:p>
     <w:p>
       <w:pPr>
-        <w:keepNext/>
         <w:spacing w:after="35" w:line="360" w:lineRule="auto"/>
         <w:jc w:val="both"/>
         <w:ind w:firstLine="720"/>
+        <w:keepLines/>
       </w:pPr>
       <w:r>
         <w:rPr>
@@ -9388,15 +9190,6 @@
           <w:szCs w:val="20"/>
         </w:rPr>
         <w:t>IF derived(periodontal_destruction) AND kb(defining_feature(periodontitis,support_loss)) THEN candidate(periodontitis).</w:t>
-      </w:r>
-    </w:p>
-    <w:p>
-      <w:pPr>
-        <w:pStyle w:val="Caption"/>
-        <w:spacing w:after="65" w:line="200" w:lineRule="auto"/>
-      </w:pPr>
-      <w:r>
-        <w:t>Source: efp; review: pending.</w:t>
       </w:r>
     </w:p>
     <w:p>
@@ -9417,10 +9210,10 @@
     </w:p>
     <w:p>
       <w:pPr>
-        <w:keepNext/>
         <w:spacing w:after="35" w:line="360" w:lineRule="auto"/>
         <w:jc w:val="both"/>
         <w:ind w:firstLine="720"/>
+        <w:keepLines/>
       </w:pPr>
       <w:r>
         <w:rPr>
@@ -9429,15 +9222,6 @@
           <w:szCs w:val="20"/>
         </w:rPr>
         <w:t>IF gt(pocket_mm,3) AND kb(buccal_pocket_threshold(3)) THEN deep_pocket.</w:t>
-      </w:r>
-    </w:p>
-    <w:p>
-      <w:pPr>
-        <w:pStyle w:val="Caption"/>
-        <w:spacing w:after="65" w:line="200" w:lineRule="auto"/>
-      </w:pPr>
-      <w:r>
-        <w:t>Source: efp; review: pending.</w:t>
       </w:r>
     </w:p>
     <w:p>
@@ -9458,10 +9242,10 @@
     </w:p>
     <w:p>
       <w:pPr>
-        <w:keepNext/>
         <w:spacing w:after="35" w:line="360" w:lineRule="auto"/>
         <w:jc w:val="both"/>
         <w:ind w:firstLine="720"/>
+        <w:keepLines/>
       </w:pPr>
       <w:r>
         <w:rPr>
@@ -9470,15 +9254,6 @@
           <w:szCs w:val="20"/>
         </w:rPr>
         <w:t>IF gte(bop_percent,10) AND eq(plaque,yes) THEN gingival_inflammation.</w:t>
-      </w:r>
-    </w:p>
-    <w:p>
-      <w:pPr>
-        <w:pStyle w:val="Caption"/>
-        <w:spacing w:after="65" w:line="200" w:lineRule="auto"/>
-      </w:pPr>
-      <w:r>
-        <w:t>Source: efp_g; review: pending.</w:t>
       </w:r>
     </w:p>
     <w:sectPr>

</xml_diff>